<commit_message>
Update dev deployment documentation
</commit_message>
<xml_diff>
--- a/docs/aws-infrastructure-and-migration-record.docx
+++ b/docs/aws-infrastructure-and-migration-record.docx
@@ -46,13 +46,7 @@
     </w:p>
     <w:p>
       <w:r>
-        <w:rPr>
-          <w:rFonts w:ascii="Arial" w:hAnsi="Arial"/>
-          <w:b w:val="0"/>
-          <w:color w:val="17324D"/>
-          <w:sz w:val="20"/>
-        </w:rPr>
-        <w:t>This record follows the Deal and Drive dev setup from AWS CLI access through Terraform, deployment, and data migration. It separates completed checks from items that still require organization or registrar access. No AWS keys, database passwords, API tokens, or GitHub tokens are included.</w:t>
+        <w:t>This record summarizes the Deal and Drive dev AWS setup, Terraform management, application deployment path, and data migration. It distinguishes verified pipeline results from live application checks that should be repeated when needed. It contains no AWS access keys, database passwords, API tokens, or GitHub tokens.</w:t>
       </w:r>
     </w:p>
     <w:tbl>
@@ -243,13 +237,7 @@
               <w:spacing w:after="20"/>
             </w:pPr>
             <w:r>
-              <w:rPr>
-                <w:rFonts w:ascii="Arial" w:hAnsi="Arial"/>
-                <w:b w:val="0"/>
-                <w:color w:val="17324D"/>
-                <w:sz w:val="16"/>
-              </w:rPr>
-              <w:t>A new-account profile was used for the dev AWS account, and a separate syed-personal-iam-user profile was kept for the older personal account. A scoped pre-dev deployment profile was also present during the rollout.</w:t>
+              <w:t>The new-account CLI profile is deal-drive-kishore-dev-iam-user; a separate syed-personal-iam-user profile was used for the legacy source account. Confirm the active identity before any write operation.</w:t>
             </w:r>
           </w:p>
         </w:tc>
@@ -506,13 +494,7 @@
     </w:p>
     <w:p>
       <w:r>
-        <w:rPr>
-          <w:rFonts w:ascii="Arial" w:hAnsi="Arial"/>
-          <w:b w:val="0"/>
-          <w:color w:val="17324D"/>
-          <w:sz w:val="20"/>
-        </w:rPr>
-        <w:t>Infrastructure code is kept in the separate deal-drive-iac-cloud repository. The bootstrap configuration creates the remote state bucket and deployment role prerequisites; envs/dev composes the network, platform, database, storage, edge, IAM, and logging resources. The dev state is stored remotely in S3 with the configured key under the deal-and-drive/dev prefix.</w:t>
+        <w:t>Infrastructure code is maintained in the separate private deal-drive-iac-cloud repository. The bootstrap root manages Terraform state storage and deployment identity; envs/dev composes the network, platform, database, storage, edge, IAM, and logging resources. Dev state is stored remotely in S3. The current IaC workflow uses a dedicated Terraform IAM user through the IaC repository's development GitHub environment secrets because OIDC is not enabled in the organization. Terraform validation, AWS account verification, and plan/apply run as three sequential stages.</w:t>
       </w:r>
     </w:p>
     <w:tbl>
@@ -1491,7 +1473,7 @@
               <w:spacing w:after="20"/>
             </w:pPr>
             <w:r>
-              <w:t>Frontend bucket is behind CloudFront OAC; copied upload bucket was reported at latest note: latest note: 23 / 2.85 MB; older README: 21 / 2,578,172 bytes; recheck; older README: 21 objects / 2,578,172 bytes, recheck count during verification.</w:t>
+              <w:t>The frontend bucket is private and served through CloudFront OAC; the uploads bucket is private. Migration counts differed across historical notes, so run a fresh object inventory before treating totals as a final audit.</w:t>
             </w:r>
           </w:p>
         </w:tc>
@@ -1553,13 +1535,7 @@
               <w:spacing w:after="20"/>
             </w:pPr>
             <w:r>
-              <w:rPr>
-                <w:rFonts w:ascii="Arial" w:hAnsi="Arial"/>
-                <w:b w:val="0"/>
-                <w:color w:val="17324D"/>
-                <w:sz w:val="16"/>
-              </w:rPr>
-              <w:t>CloudFront default hostname is available; custom domain is currently disabled in dev settings.</w:t>
+              <w:t>CloudFront is the public website entry point; WAF filters viewer traffic. Custom-domain support uses ACM in us-east-1 and CloudFront aliases; confirm current DNS and HTTPS response when troubleshooting.</w:t>
             </w:r>
           </w:p>
         </w:tc>
@@ -1731,13 +1707,7 @@
               <w:spacing w:after="20"/>
             </w:pPr>
             <w:r>
-              <w:rPr>
-                <w:rFonts w:ascii="Arial" w:hAnsi="Arial"/>
-                <w:b w:val="0"/>
-                <w:color w:val="17324D"/>
-                <w:sz w:val="16"/>
-              </w:rPr>
-              <w:t>Hosts the public zone and will route the custom domain once delegated.</w:t>
+              <w:t>Hosts the public DNS zone and provides records that resolve the site to CloudFront.</w:t>
             </w:r>
           </w:p>
         </w:tc>
@@ -1751,13 +1721,7 @@
               <w:spacing w:after="20"/>
             </w:pPr>
             <w:r>
-              <w:rPr>
-                <w:rFonts w:ascii="Arial" w:hAnsi="Arial"/>
-                <w:b w:val="0"/>
-                <w:color w:val="17324D"/>
-                <w:sz w:val="16"/>
-              </w:rPr>
-              <w:t>The Terraform code includes a hosted zone. GoDaddy nameserver cutover and custom-domain enablement remain pending.</w:t>
+              <w:t>The public zone and website aliases are managed in Route 53; GoDaddy remains registrar and delegates the domain to the zone's nameservers. Confirm live DNS resolution independently when needed.</w:t>
             </w:r>
           </w:p>
         </w:tc>
@@ -2029,13 +1993,7 @@
               <w:spacing w:after="20"/>
             </w:pPr>
             <w:r>
-              <w:rPr>
-                <w:rFonts w:ascii="Arial" w:hAnsi="Arial"/>
-                <w:b w:val="0"/>
-                <w:color w:val="17324D"/>
-                <w:sz w:val="16"/>
-              </w:rPr>
-              <w:t>A pull request to dev runs validation; it does not deploy.</w:t>
+              <w:t>A pull request to dev runs validation and builds the API Docker image without publishing. It does not apply Terraform or deploy the app.</w:t>
             </w:r>
           </w:p>
         </w:tc>
@@ -2076,13 +2034,7 @@
               <w:spacing w:after="20"/>
             </w:pPr>
             <w:r>
-              <w:rPr>
-                <w:rFonts w:ascii="Arial" w:hAnsi="Arial"/>
-                <w:b w:val="0"/>
-                <w:color w:val="17324D"/>
-                <w:sz w:val="16"/>
-              </w:rPr>
-              <w:t>After merge, a push to dev builds the API Docker image and pushes an immutable Git-SHA tag to ECR.</w:t>
+              <w:t>After merge, a push to dev publishes an immutable commit-SHA API image to the dev ECR repository.</w:t>
             </w:r>
           </w:p>
         </w:tc>
@@ -2335,13 +2287,7 @@
         <w:spacing w:after="60"/>
       </w:pPr>
       <w:r>
-        <w:rPr>
-          <w:rFonts w:ascii="Arial" w:hAnsi="Arial"/>
-          <w:b w:val="0"/>
-          <w:color w:val="17324D"/>
-          <w:sz w:val="20"/>
-        </w:rPr>
-        <w:t>The latest recorded pre-dev application deployment run completed successfully through ECS, frontend build, S3 upload, and CloudFront invalidation. It was a pre-dev run; it does not prove that the revised dev branch pipeline has run.</w:t>
+        <w:t>The latest recorded Terraform dev workflow completed successfully: recursive formatting, bootstrap and dev validation, AWS account verification, remote-state initialization, plan, and apply all passed. This verifies the IaC deployment run; it does not by itself verify the separate application repository's most recent release or the public website's current response.</w:t>
       </w:r>
     </w:p>
     <w:p>
@@ -2350,13 +2296,7 @@
         <w:spacing w:after="60"/>
       </w:pPr>
       <w:r>
-        <w:rPr>
-          <w:rFonts w:ascii="Arial" w:hAnsi="Arial"/>
-          <w:b w:val="0"/>
-          <w:color w:val="17324D"/>
-          <w:sz w:val="20"/>
-        </w:rPr>
-        <w:t>A direct ECS deployment preflight completed task registration, migration task, service update, and service stability checks after fixing the missing ecs:TagResource permission and the API security group lookup.</w:t>
+        <w:t>A direct ECS deployment preflight previously completed task registration, migration task, service update, and service stability checks after fixing the missing ecs:TagResource permission and the API security group lookup.</w:t>
       </w:r>
     </w:p>
     <w:p>
@@ -2364,13 +2304,7 @@
         <w:pStyle w:val="Heading1"/>
       </w:pPr>
       <w:r>
-        <w:rPr>
-          <w:rFonts w:ascii="Arial" w:hAnsi="Arial"/>
-          <w:b/>
-          <w:color w:val="17324D"/>
-          <w:sz w:val="32"/>
-        </w:rPr>
-        <w:t>7. Items still pending</w:t>
+        <w:t>7. Follow-up and operational checks</w:t>
       </w:r>
     </w:p>
     <w:tbl>
@@ -2473,13 +2407,7 @@
               <w:spacing w:after="20"/>
             </w:pPr>
             <w:r>
-              <w:rPr>
-                <w:rFonts w:ascii="Arial" w:hAnsi="Arial"/>
-                <w:b w:val="0"/>
-                <w:color w:val="17324D"/>
-                <w:sz w:val="16"/>
-              </w:rPr>
-              <w:t>Terraform GitHub OIDC apply</w:t>
+              <w:t>Migrate Terraform CI to OIDC</w:t>
             </w:r>
           </w:p>
         </w:tc>
@@ -2494,13 +2422,7 @@
               <w:spacing w:after="20"/>
             </w:pPr>
             <w:r>
-              <w:rPr>
-                <w:rFonts w:ascii="Arial" w:hAnsi="Arial"/>
-                <w:b w:val="0"/>
-                <w:color w:val="17324D"/>
-                <w:sz w:val="16"/>
-              </w:rPr>
-              <w:t>The organization must allow the GitHub OIDC provider, and the development environment needs AWS_DEPLOY_ROLE_ARN. Terraform validation can pass while apply is skipped.</w:t>
+              <w:t>Organization-level OIDC is not currently enabled. The IaC pipeline uses a dedicated static-key IAM user stored in the IaC development environment.</w:t>
             </w:r>
           </w:p>
         </w:tc>
@@ -2515,13 +2437,7 @@
               <w:spacing w:after="20"/>
             </w:pPr>
             <w:r>
-              <w:rPr>
-                <w:rFonts w:ascii="Arial" w:hAnsi="Arial"/>
-                <w:b w:val="0"/>
-                <w:color w:val="17324D"/>
-                <w:sz w:val="16"/>
-              </w:rPr>
-              <w:t>Organization admin enables the provider; configure the approved role ARN; run a reviewed dev apply.</w:t>
+              <w:t>When allowed, configure GitHub OIDC trust scoped to this repository and dev environment, switch the workflow to role assumption, then revoke the static IAM access key.</w:t>
             </w:r>
           </w:p>
         </w:tc>
@@ -2538,7 +2454,7 @@
           </w:tcPr>
           <w:p>
             <w:r>
-              <w:t>App environment branch allow-list</w:t>
+              <w:t>Verify application dev release</w:t>
             </w:r>
           </w:p>
         </w:tc>
@@ -2550,7 +2466,7 @@
           </w:tcPr>
           <w:p>
             <w:r>
-              <w:t>Changed from pre-dev to dev for the new deployment path.</w:t>
+              <w:t>The successful Terraform run confirms infrastructure plan/apply, not the latest app deployment.</w:t>
             </w:r>
           </w:p>
         </w:tc>
@@ -2562,7 +2478,7 @@
           </w:tcPr>
           <w:p>
             <w:r>
-              <w:t>Verify the first dev deployment loads the scoped credentials.</w:t>
+              <w:t>Check the application repository's GitHub Actions dev push run and confirm Stage 8 ECR publish and Stage 9 deployment succeeded.</w:t>
             </w:r>
           </w:p>
         </w:tc>
@@ -2581,13 +2497,7 @@
               <w:spacing w:after="20"/>
             </w:pPr>
             <w:r>
-              <w:rPr>
-                <w:rFonts w:ascii="Arial" w:hAnsi="Arial"/>
-                <w:b w:val="0"/>
-                <w:color w:val="17324D"/>
-                <w:sz w:val="16"/>
-              </w:rPr>
-              <w:t>GoDaddy domain delegation</w:t>
+              <w:t>Verify custom-domain response</w:t>
             </w:r>
           </w:p>
         </w:tc>
@@ -2601,13 +2511,7 @@
               <w:spacing w:after="20"/>
             </w:pPr>
             <w:r>
-              <w:rPr>
-                <w:rFonts w:ascii="Arial" w:hAnsi="Arial"/>
-                <w:b w:val="0"/>
-                <w:color w:val="17324D"/>
-                <w:sz w:val="16"/>
-              </w:rPr>
-              <w:t>The domain still resolves to the prior provider, while custom-domain support is disabled in dev Terraform.</w:t>
+              <w:t>Route 53 and CloudFront configuration is managed in Terraform; a successful apply is not a substitute for checking browser and DNS behavior.</w:t>
             </w:r>
           </w:p>
         </w:tc>
@@ -2621,13 +2525,7 @@
               <w:spacing w:after="20"/>
             </w:pPr>
             <w:r>
-              <w:rPr>
-                <w:rFonts w:ascii="Arial" w:hAnsi="Arial"/>
-                <w:b w:val="0"/>
-                <w:color w:val="17324D"/>
-                <w:sz w:val="16"/>
-              </w:rPr>
-              <w:t>Copy any MX/TXT/email records, enable ACM/CloudFront aliases and Route 53 records through Terraform, verify certificate and distribution, then replace GoDaddy nameservers with the four nameservers for the correct hosted zone.</w:t>
+              <w:t>Check DNS resolution, ACM certificate status, CloudFront distribution configuration, and the site response for both apex and www hostnames.</w:t>
             </w:r>
           </w:p>
         </w:tc>
@@ -2647,13 +2545,7 @@
               <w:spacing w:after="20"/>
             </w:pPr>
             <w:r>
-              <w:rPr>
-                <w:rFonts w:ascii="Arial" w:hAnsi="Arial"/>
-                <w:b w:val="0"/>
-                <w:color w:val="17324D"/>
-                <w:sz w:val="16"/>
-              </w:rPr>
-              <w:t>Merge to dev</w:t>
+              <w:t>Database recovery</w:t>
             </w:r>
           </w:p>
         </w:tc>
@@ -2668,13 +2560,7 @@
               <w:spacing w:after="20"/>
             </w:pPr>
             <w:r>
-              <w:rPr>
-                <w:rFonts w:ascii="Arial" w:hAnsi="Arial"/>
-                <w:b w:val="0"/>
-                <w:color w:val="17324D"/>
-                <w:sz w:val="16"/>
-              </w:rPr>
-              <w:t>The current application changes are in a pull request and the IaC repository is private.</w:t>
+              <w:t>Automated backups are disabled by prior user approval; the database has no automated point-in-time recovery.</w:t>
             </w:r>
           </w:p>
         </w:tc>
@@ -2689,13 +2575,7 @@
               <w:spacing w:after="20"/>
             </w:pPr>
             <w:r>
-              <w:rPr>
-                <w:rFonts w:ascii="Arial" w:hAnsi="Arial"/>
-                <w:b w:val="0"/>
-                <w:color w:val="17324D"/>
-                <w:sz w:val="16"/>
-              </w:rPr>
-              <w:t>Run the final PR checks, ensure the deployment environment is ready, and merge only after review.</w:t>
+              <w:t>Create and test a manual snapshot process, and review backup retention before storing important production data.</w:t>
             </w:r>
           </w:p>
         </w:tc>

</xml_diff>